<commit_message>
feat: inicializacao do backend e do frontend
</commit_message>
<xml_diff>
--- a/ApêndiceC-Análise/4 -VisãoComportamental/PID-Gestão-Pets.docx
+++ b/ApêndiceC-Análise/4 -VisãoComportamental/PID-Gestão-Pets.docx
@@ -902,9 +902,8 @@
                 <w:sz w:val="20"/>
                 <w:szCs w:val="20"/>
               </w:rPr>
-              <w:t xml:space="preserve">2. </w:t>
+              <w:t>2. Valida</w:t>
             </w:r>
-            <w:proofErr w:type="spellStart"/>
             <w:r>
               <w:rPr>
                 <w:rFonts w:ascii="Times New Roman" w:eastAsia="Times New Roman" w:hAnsi="Times New Roman" w:cs="Times New Roman"/>
@@ -912,9 +911,8 @@
                 <w:sz w:val="20"/>
                 <w:szCs w:val="20"/>
               </w:rPr>
-              <w:t>Valida</w:t>
+              <w:t>r</w:t>
             </w:r>
-            <w:proofErr w:type="spellEnd"/>
             <w:r>
               <w:rPr>
                 <w:rFonts w:ascii="Times New Roman" w:eastAsia="Times New Roman" w:hAnsi="Times New Roman" w:cs="Times New Roman"/>
@@ -2257,6 +2255,7 @@
   <w:style w:type="character" w:default="1" w:styleId="Fontepargpadro">
     <w:name w:val="Default Paragraph Font"/>
     <w:uiPriority w:val="1"/>
+    <w:semiHidden/>
     <w:unhideWhenUsed/>
   </w:style>
   <w:style w:type="table" w:default="1" w:styleId="Tabelanormal">

</xml_diff>